<commit_message>
Leaves trait data added and C. ramosissimum name corrected from data files
</commit_message>
<xml_diff>
--- a/doc/Germination drivers outline_lg.docx
+++ b/doc/Germination drivers outline_lg.docx
@@ -1,6 +1,6 @@
 
 <file path=word/document.xml><?xml version="1.0" encoding="utf-8"?>
-<w:document xmlns:wpc="http://schemas.microsoft.com/office/word/2010/wordprocessingCanvas" xmlns:cx="http://schemas.microsoft.com/office/drawing/2014/chartex" xmlns:cx1="http://schemas.microsoft.com/office/drawing/2015/9/8/chartex" xmlns:cx2="http://schemas.microsoft.com/office/drawing/2015/10/21/chartex" xmlns:cx3="http://schemas.microsoft.com/office/drawing/2016/5/9/chartex" xmlns:cx4="http://schemas.microsoft.com/office/drawing/2016/5/10/chartex" xmlns:cx5="http://schemas.microsoft.com/office/drawing/2016/5/11/chartex" xmlns:cx6="http://schemas.microsoft.com/office/drawing/2016/5/12/chartex" xmlns:cx7="http://schemas.microsoft.com/office/drawing/2016/5/13/chartex" xmlns:cx8="http://schemas.microsoft.com/office/drawing/2016/5/14/chartex" xmlns:mc="http://schemas.openxmlformats.org/markup-compatibility/2006" xmlns:aink="http://schemas.microsoft.com/office/drawing/2016/ink" xmlns:am3d="http://schemas.microsoft.com/office/drawing/2017/model3d" xmlns:o="urn:schemas-microsoft-com:office:office" xmlns:oel="http://schemas.microsoft.com/office/2019/extlst" xmlns:r="http://schemas.openxmlformats.org/officeDocument/2006/relationships" xmlns:m="http://schemas.openxmlformats.org/officeDocument/2006/math" xmlns:v="urn:schemas-microsoft-com:vml" xmlns:wp14="http://schemas.microsoft.com/office/word/2010/wordprocessingDrawing" xmlns:wp="http://schemas.openxmlformats.org/drawingml/2006/wordprocessingDrawing" xmlns:w10="urn:schemas-microsoft-com:office:word" xmlns:w="http://schemas.openxmlformats.org/wordprocessingml/2006/main" xmlns:w14="http://schemas.microsoft.com/office/word/2010/wordml" xmlns:w15="http://schemas.microsoft.com/office/word/2012/wordml" xmlns:w16cex="http://schemas.microsoft.com/office/word/2018/wordml/cex" xmlns:w16cid="http://schemas.microsoft.com/office/word/2016/wordml/cid" xmlns:w16="http://schemas.microsoft.com/office/word/2018/wordml" xmlns:w16sdtdh="http://schemas.microsoft.com/office/word/2020/wordml/sdtdatahash" xmlns:w16se="http://schemas.microsoft.com/office/word/2015/wordml/symex" xmlns:wpg="http://schemas.microsoft.com/office/word/2010/wordprocessingGroup" xmlns:wpi="http://schemas.microsoft.com/office/word/2010/wordprocessingInk" xmlns:wne="http://schemas.microsoft.com/office/word/2006/wordml" xmlns:wps="http://schemas.microsoft.com/office/word/2010/wordprocessingShape" mc:Ignorable="w14 w15 w16se w16cid w16 w16cex w16sdtdh wp14">
+<w:document xmlns:wpc="http://schemas.microsoft.com/office/word/2010/wordprocessingCanvas" xmlns:mc="http://schemas.openxmlformats.org/markup-compatibility/2006" xmlns:o="urn:schemas-microsoft-com:office:office" xmlns:r="http://schemas.openxmlformats.org/officeDocument/2006/relationships" xmlns:m="http://schemas.openxmlformats.org/officeDocument/2006/math" xmlns:v="urn:schemas-microsoft-com:vml" xmlns:wp14="http://schemas.microsoft.com/office/word/2010/wordprocessingDrawing" xmlns:wp="http://schemas.openxmlformats.org/drawingml/2006/wordprocessingDrawing" xmlns:w10="urn:schemas-microsoft-com:office:word" xmlns:w="http://schemas.openxmlformats.org/wordprocessingml/2006/main" xmlns:w14="http://schemas.microsoft.com/office/word/2010/wordml" xmlns:w15="http://schemas.microsoft.com/office/word/2012/wordml" xmlns:wpg="http://schemas.microsoft.com/office/word/2010/wordprocessingGroup" xmlns:wpi="http://schemas.microsoft.com/office/word/2010/wordprocessingInk" xmlns:wne="http://schemas.microsoft.com/office/word/2006/wordml" xmlns:wps="http://schemas.microsoft.com/office/word/2010/wordprocessingShape" mc:Ignorable="w14 w15 wp14">
   <w:body>
     <w:p>
       <w:pPr>
@@ -157,6 +157,540 @@
         </w:rPr>
         <w:t xml:space="preserve"> &amp; Jiménez-Alfaro, B.</w:t>
       </w:r>
+    </w:p>
+    <w:p>
+      <w:pPr>
+        <w:spacing w:after="0" w:line="360" w:lineRule="auto"/>
+        <w:textAlignment w:val="baseline"/>
+        <w:rPr>
+          <w:rFonts w:eastAsia="Times New Roman" w:cstheme="minorHAnsi"/>
+          <w:bCs/>
+          <w:color w:val="000000"/>
+          <w:bdr w:val="none" w:sz="0" w:space="0" w:color="auto" w:frame="1"/>
+          <w:lang w:val="es-ES" w:eastAsia="ca-ES"/>
+        </w:rPr>
+      </w:pPr>
+    </w:p>
+    <w:p>
+      <w:pPr>
+        <w:spacing w:after="0" w:line="360" w:lineRule="auto"/>
+        <w:textAlignment w:val="baseline"/>
+        <w:rPr>
+          <w:rFonts w:eastAsia="Times New Roman" w:cstheme="minorHAnsi"/>
+          <w:color w:val="000000"/>
+          <w:lang w:val="en-US" w:eastAsia="ca-ES"/>
+        </w:rPr>
+      </w:pPr>
+      <w:r>
+        <w:rPr>
+          <w:lang w:val="es-ES"/>
+        </w:rPr>
+        <w:t xml:space="preserve">Clara Espinosa Del Alba. </w:t>
+      </w:r>
+      <w:r>
+        <w:rPr>
+          <w:rFonts w:eastAsia="Times New Roman" w:cstheme="minorHAnsi"/>
+          <w:color w:val="000000"/>
+          <w:lang w:val="en-US" w:eastAsia="ca-ES"/>
+        </w:rPr>
+        <w:t>Biodiversity Research Institute, IMIB (Univ. Oviedo-CSIC-</w:t>
+      </w:r>
+      <w:proofErr w:type="spellStart"/>
+      <w:r>
+        <w:rPr>
+          <w:rFonts w:eastAsia="Times New Roman" w:cstheme="minorHAnsi"/>
+          <w:color w:val="000000"/>
+          <w:lang w:val="en-US" w:eastAsia="ca-ES"/>
+        </w:rPr>
+        <w:t>Princ</w:t>
+      </w:r>
+      <w:proofErr w:type="spellEnd"/>
+      <w:r>
+        <w:rPr>
+          <w:rFonts w:eastAsia="Times New Roman" w:cstheme="minorHAnsi"/>
+          <w:color w:val="000000"/>
+          <w:lang w:val="en-US" w:eastAsia="ca-ES"/>
+        </w:rPr>
+        <w:t xml:space="preserve">. </w:t>
+      </w:r>
+      <w:r>
+        <w:rPr>
+          <w:rFonts w:eastAsia="Times New Roman" w:cstheme="minorHAnsi"/>
+          <w:color w:val="000000"/>
+          <w:lang w:val="en-US" w:eastAsia="ca-ES"/>
+        </w:rPr>
+        <w:t xml:space="preserve">Asturias), 33600 </w:t>
+      </w:r>
+      <w:proofErr w:type="spellStart"/>
+      <w:r>
+        <w:rPr>
+          <w:rFonts w:eastAsia="Times New Roman" w:cstheme="minorHAnsi"/>
+          <w:color w:val="000000"/>
+          <w:lang w:val="en-US" w:eastAsia="ca-ES"/>
+        </w:rPr>
+        <w:t>Mieres</w:t>
+      </w:r>
+      <w:proofErr w:type="spellEnd"/>
+      <w:r>
+        <w:rPr>
+          <w:rFonts w:eastAsia="Times New Roman" w:cstheme="minorHAnsi"/>
+          <w:color w:val="000000"/>
+          <w:lang w:val="en-US" w:eastAsia="ca-ES"/>
+        </w:rPr>
+        <w:t>, Spain.</w:t>
+      </w:r>
+      <w:r>
+        <w:rPr>
+          <w:rStyle w:val="Ttulo3Car"/>
+          <w:rFonts w:cstheme="minorHAnsi"/>
+          <w:lang w:val="en-US"/>
+        </w:rPr>
+        <w:t xml:space="preserve"> </w:t>
+      </w:r>
+      <w:r>
+        <w:rPr>
+          <w:rStyle w:val="Hipervnculo"/>
+          <w:rFonts w:cstheme="minorHAnsi"/>
+          <w:lang w:val="en-US"/>
+        </w:rPr>
+        <w:t>https://orcid.org/0000-0001-8634-5808</w:t>
+      </w:r>
+      <w:r>
+        <w:rPr>
+          <w:rStyle w:val="Hipervnculo"/>
+          <w:rFonts w:cstheme="minorHAnsi"/>
+          <w:lang w:val="en-US"/>
+        </w:rPr>
+        <w:t>.</w:t>
+      </w:r>
+      <w:r>
+        <w:rPr>
+          <w:rFonts w:eastAsia="Times New Roman" w:cstheme="minorHAnsi"/>
+          <w:color w:val="000000"/>
+          <w:lang w:val="en-US" w:eastAsia="ca-ES"/>
+        </w:rPr>
+        <w:t xml:space="preserve"> </w:t>
+      </w:r>
+      <w:r>
+        <w:rPr>
+          <w:lang w:val="en-US"/>
+        </w:rPr>
+        <w:t xml:space="preserve">Email: </w:t>
+      </w:r>
+      <w:hyperlink r:id="rId5" w:history="1">
+        <w:r>
+          <w:rPr>
+            <w:rStyle w:val="Hipervnculo"/>
+            <w:lang w:val="en-US"/>
+          </w:rPr>
+          <w:t>espinosaclara@uniovi.es</w:t>
+        </w:r>
+      </w:hyperlink>
+    </w:p>
+    <w:p>
+      <w:pPr>
+        <w:pStyle w:val="FirstParagraph"/>
+        <w:spacing w:before="120" w:after="0"/>
+        <w:rPr>
+          <w:rFonts w:asciiTheme="minorHAnsi" w:hAnsiTheme="minorHAnsi" w:cstheme="minorBidi"/>
+          <w:sz w:val="22"/>
+          <w:szCs w:val="22"/>
+          <w:lang w:val="es-ES"/>
+        </w:rPr>
+      </w:pPr>
+      <w:r>
+        <w:rPr>
+          <w:rFonts w:asciiTheme="minorHAnsi" w:hAnsiTheme="minorHAnsi" w:cstheme="minorHAnsi"/>
+          <w:sz w:val="22"/>
+          <w:szCs w:val="22"/>
+        </w:rPr>
+        <w:t xml:space="preserve">Eduardo </w:t>
+      </w:r>
+      <w:proofErr w:type="spellStart"/>
+      <w:r>
+        <w:rPr>
+          <w:rFonts w:asciiTheme="minorHAnsi" w:hAnsiTheme="minorHAnsi" w:cstheme="minorHAnsi"/>
+          <w:sz w:val="22"/>
+          <w:szCs w:val="22"/>
+        </w:rPr>
+        <w:t>Fernández-Pascual</w:t>
+      </w:r>
+      <w:proofErr w:type="spellEnd"/>
+      <w:r>
+        <w:rPr>
+          <w:rFonts w:asciiTheme="minorHAnsi" w:hAnsiTheme="minorHAnsi" w:cstheme="minorHAnsi"/>
+          <w:sz w:val="22"/>
+          <w:szCs w:val="22"/>
+        </w:rPr>
+        <w:t xml:space="preserve">. </w:t>
+      </w:r>
+      <w:r>
+        <w:rPr>
+          <w:rFonts w:asciiTheme="minorHAnsi" w:eastAsia="Times New Roman" w:hAnsiTheme="minorHAnsi" w:cstheme="minorHAnsi"/>
+          <w:color w:val="000000"/>
+          <w:sz w:val="22"/>
+          <w:szCs w:val="22"/>
+          <w:lang w:eastAsia="ca-ES"/>
+        </w:rPr>
+        <w:t>Biodiversity Research Institute, IMIB (Univ. Oviedo-CSIC-</w:t>
+      </w:r>
+      <w:proofErr w:type="spellStart"/>
+      <w:r>
+        <w:rPr>
+          <w:rFonts w:asciiTheme="minorHAnsi" w:eastAsia="Times New Roman" w:hAnsiTheme="minorHAnsi" w:cstheme="minorHAnsi"/>
+          <w:color w:val="000000"/>
+          <w:sz w:val="22"/>
+          <w:szCs w:val="22"/>
+          <w:lang w:eastAsia="ca-ES"/>
+        </w:rPr>
+        <w:t>Princ</w:t>
+      </w:r>
+      <w:proofErr w:type="spellEnd"/>
+      <w:r>
+        <w:rPr>
+          <w:rFonts w:asciiTheme="minorHAnsi" w:eastAsia="Times New Roman" w:hAnsiTheme="minorHAnsi" w:cstheme="minorHAnsi"/>
+          <w:color w:val="000000"/>
+          <w:sz w:val="22"/>
+          <w:szCs w:val="22"/>
+          <w:lang w:eastAsia="ca-ES"/>
+        </w:rPr>
+        <w:t xml:space="preserve">. </w:t>
+      </w:r>
+      <w:r>
+        <w:rPr>
+          <w:rFonts w:asciiTheme="minorHAnsi" w:eastAsia="Times New Roman" w:hAnsiTheme="minorHAnsi" w:cstheme="minorHAnsi"/>
+          <w:color w:val="000000"/>
+          <w:sz w:val="22"/>
+          <w:szCs w:val="22"/>
+          <w:lang w:eastAsia="ca-ES"/>
+        </w:rPr>
+        <w:t xml:space="preserve">Asturias), 33600 </w:t>
+      </w:r>
+      <w:proofErr w:type="spellStart"/>
+      <w:r>
+        <w:rPr>
+          <w:rFonts w:asciiTheme="minorHAnsi" w:eastAsia="Times New Roman" w:hAnsiTheme="minorHAnsi" w:cstheme="minorHAnsi"/>
+          <w:color w:val="000000"/>
+          <w:sz w:val="22"/>
+          <w:szCs w:val="22"/>
+          <w:lang w:eastAsia="ca-ES"/>
+        </w:rPr>
+        <w:t>Mieres</w:t>
+      </w:r>
+      <w:proofErr w:type="spellEnd"/>
+      <w:r>
+        <w:rPr>
+          <w:rFonts w:asciiTheme="minorHAnsi" w:eastAsia="Times New Roman" w:hAnsiTheme="minorHAnsi" w:cstheme="minorHAnsi"/>
+          <w:color w:val="000000"/>
+          <w:sz w:val="22"/>
+          <w:szCs w:val="22"/>
+          <w:lang w:eastAsia="ca-ES"/>
+        </w:rPr>
+        <w:t xml:space="preserve">, Spain. </w:t>
+      </w:r>
+      <w:hyperlink r:id="rId6" w:history="1">
+        <w:r>
+          <w:rPr>
+            <w:rStyle w:val="Hipervnculo"/>
+            <w:rFonts w:cstheme="minorHAnsi"/>
+            <w:lang w:val="es-ES"/>
+          </w:rPr>
+          <w:t>https://orcid.org/0000-0002-4743-9577</w:t>
+        </w:r>
+      </w:hyperlink>
+      <w:r>
+        <w:rPr>
+          <w:rStyle w:val="Hipervnculo"/>
+          <w:rFonts w:cstheme="minorHAnsi"/>
+          <w:lang w:val="es-ES"/>
+        </w:rPr>
+        <w:t>.</w:t>
+      </w:r>
+      <w:r>
+        <w:rPr>
+          <w:rFonts w:asciiTheme="minorHAnsi" w:hAnsiTheme="minorHAnsi" w:cstheme="minorHAnsi"/>
+          <w:sz w:val="22"/>
+          <w:szCs w:val="22"/>
+          <w:lang w:val="es-ES"/>
+        </w:rPr>
+        <w:t xml:space="preserve"> </w:t>
+      </w:r>
+      <w:r>
+        <w:rPr>
+          <w:rFonts w:asciiTheme="minorHAnsi" w:hAnsiTheme="minorHAnsi" w:cstheme="minorBidi"/>
+          <w:sz w:val="22"/>
+          <w:szCs w:val="22"/>
+          <w:lang w:val="es-ES"/>
+        </w:rPr>
+        <w:t>Ema</w:t>
+      </w:r>
+      <w:r>
+        <w:rPr>
+          <w:rFonts w:asciiTheme="minorHAnsi" w:hAnsiTheme="minorHAnsi" w:cstheme="minorBidi"/>
+          <w:sz w:val="22"/>
+          <w:szCs w:val="22"/>
+          <w:lang w:val="es-ES"/>
+        </w:rPr>
+        <w:t xml:space="preserve">il: </w:t>
+      </w:r>
+      <w:hyperlink r:id="rId7" w:history="1">
+        <w:r>
+          <w:rPr>
+            <w:rStyle w:val="Hipervnculo"/>
+            <w:rFonts w:asciiTheme="minorHAnsi" w:hAnsiTheme="minorHAnsi" w:cstheme="minorBidi"/>
+            <w:sz w:val="22"/>
+            <w:szCs w:val="22"/>
+            <w:lang w:val="es-ES"/>
+          </w:rPr>
+          <w:t>fernandezpeduardo@uniovi.es</w:t>
+        </w:r>
+      </w:hyperlink>
+    </w:p>
+    <w:p>
+      <w:pPr>
+        <w:pStyle w:val="Textoindependiente"/>
+        <w:rPr>
+          <w:lang w:val="es-ES"/>
+        </w:rPr>
+      </w:pPr>
+      <w:proofErr w:type="spellStart"/>
+      <w:r>
+        <w:rPr>
+          <w:rFonts w:eastAsia="Times New Roman" w:cstheme="minorHAnsi"/>
+          <w:bCs/>
+          <w:color w:val="000000"/>
+          <w:highlight w:val="yellow"/>
+          <w:bdr w:val="none" w:sz="0" w:space="0" w:color="auto" w:frame="1"/>
+          <w:lang w:val="es-ES" w:eastAsia="ca-ES"/>
+        </w:rPr>
+        <w:t>Götzenberger</w:t>
+      </w:r>
+      <w:proofErr w:type="spellEnd"/>
+      <w:r>
+        <w:rPr>
+          <w:rFonts w:eastAsia="Times New Roman" w:cstheme="minorHAnsi"/>
+          <w:bCs/>
+          <w:color w:val="000000"/>
+          <w:highlight w:val="yellow"/>
+          <w:bdr w:val="none" w:sz="0" w:space="0" w:color="auto" w:frame="1"/>
+          <w:lang w:val="es-ES" w:eastAsia="ca-ES"/>
+        </w:rPr>
+        <w:t>, Lars</w:t>
+      </w:r>
+      <w:r>
+        <w:rPr>
+          <w:rFonts w:eastAsia="Times New Roman" w:cstheme="minorHAnsi"/>
+          <w:bCs/>
+          <w:color w:val="000000"/>
+          <w:bdr w:val="none" w:sz="0" w:space="0" w:color="auto" w:frame="1"/>
+          <w:lang w:val="es-ES" w:eastAsia="ca-ES"/>
+        </w:rPr>
+        <w:t xml:space="preserve"> </w:t>
+      </w:r>
+    </w:p>
+    <w:p>
+      <w:pPr>
+        <w:pStyle w:val="FirstParagraph"/>
+        <w:spacing w:before="120" w:after="0"/>
+        <w:rPr>
+          <w:rFonts w:asciiTheme="minorHAnsi" w:eastAsia="Times New Roman" w:hAnsiTheme="minorHAnsi" w:cstheme="minorHAnsi"/>
+          <w:color w:val="000000"/>
+          <w:sz w:val="22"/>
+          <w:szCs w:val="22"/>
+          <w:lang w:eastAsia="ca-ES"/>
+        </w:rPr>
+      </w:pPr>
+      <w:r>
+        <w:rPr>
+          <w:rFonts w:asciiTheme="minorHAnsi" w:hAnsiTheme="minorHAnsi" w:cstheme="minorHAnsi"/>
+          <w:sz w:val="22"/>
+          <w:szCs w:val="22"/>
+          <w:lang w:val="es-ES"/>
+        </w:rPr>
+        <w:t xml:space="preserve">Borja Jiménez-Alfaro. </w:t>
+      </w:r>
+      <w:proofErr w:type="spellStart"/>
+      <w:r>
+        <w:rPr>
+          <w:rFonts w:asciiTheme="minorHAnsi" w:eastAsia="Times New Roman" w:hAnsiTheme="minorHAnsi" w:cstheme="minorHAnsi"/>
+          <w:color w:val="000000"/>
+          <w:sz w:val="22"/>
+          <w:szCs w:val="22"/>
+          <w:lang w:val="es-ES" w:eastAsia="ca-ES"/>
+        </w:rPr>
+        <w:t>Biodiversity</w:t>
+      </w:r>
+      <w:proofErr w:type="spellEnd"/>
+      <w:r>
+        <w:rPr>
+          <w:rFonts w:asciiTheme="minorHAnsi" w:eastAsia="Times New Roman" w:hAnsiTheme="minorHAnsi" w:cstheme="minorHAnsi"/>
+          <w:color w:val="000000"/>
+          <w:sz w:val="22"/>
+          <w:szCs w:val="22"/>
+          <w:lang w:val="es-ES" w:eastAsia="ca-ES"/>
+        </w:rPr>
+        <w:t xml:space="preserve"> </w:t>
+      </w:r>
+      <w:proofErr w:type="spellStart"/>
+      <w:r>
+        <w:rPr>
+          <w:rFonts w:asciiTheme="minorHAnsi" w:eastAsia="Times New Roman" w:hAnsiTheme="minorHAnsi" w:cstheme="minorHAnsi"/>
+          <w:color w:val="000000"/>
+          <w:sz w:val="22"/>
+          <w:szCs w:val="22"/>
+          <w:lang w:val="es-ES" w:eastAsia="ca-ES"/>
+        </w:rPr>
+        <w:t>Research</w:t>
+      </w:r>
+      <w:proofErr w:type="spellEnd"/>
+      <w:r>
+        <w:rPr>
+          <w:rFonts w:asciiTheme="minorHAnsi" w:eastAsia="Times New Roman" w:hAnsiTheme="minorHAnsi" w:cstheme="minorHAnsi"/>
+          <w:color w:val="000000"/>
+          <w:sz w:val="22"/>
+          <w:szCs w:val="22"/>
+          <w:lang w:val="es-ES" w:eastAsia="ca-ES"/>
+        </w:rPr>
+        <w:t xml:space="preserve"> </w:t>
+      </w:r>
+      <w:proofErr w:type="spellStart"/>
+      <w:r>
+        <w:rPr>
+          <w:rFonts w:asciiTheme="minorHAnsi" w:eastAsia="Times New Roman" w:hAnsiTheme="minorHAnsi" w:cstheme="minorHAnsi"/>
+          <w:color w:val="000000"/>
+          <w:sz w:val="22"/>
+          <w:szCs w:val="22"/>
+          <w:lang w:val="es-ES" w:eastAsia="ca-ES"/>
+        </w:rPr>
+        <w:t>Institute</w:t>
+      </w:r>
+      <w:proofErr w:type="spellEnd"/>
+      <w:r>
+        <w:rPr>
+          <w:rFonts w:asciiTheme="minorHAnsi" w:eastAsia="Times New Roman" w:hAnsiTheme="minorHAnsi" w:cstheme="minorHAnsi"/>
+          <w:color w:val="000000"/>
+          <w:sz w:val="22"/>
+          <w:szCs w:val="22"/>
+          <w:lang w:val="es-ES" w:eastAsia="ca-ES"/>
+        </w:rPr>
+        <w:t>, IMIB (Univ. Oviedo-CSIC-</w:t>
+      </w:r>
+      <w:proofErr w:type="spellStart"/>
+      <w:r>
+        <w:rPr>
+          <w:rFonts w:asciiTheme="minorHAnsi" w:eastAsia="Times New Roman" w:hAnsiTheme="minorHAnsi" w:cstheme="minorHAnsi"/>
+          <w:color w:val="000000"/>
+          <w:sz w:val="22"/>
+          <w:szCs w:val="22"/>
+          <w:lang w:val="es-ES" w:eastAsia="ca-ES"/>
+        </w:rPr>
+        <w:t>Princ</w:t>
+      </w:r>
+      <w:proofErr w:type="spellEnd"/>
+      <w:r>
+        <w:rPr>
+          <w:rFonts w:asciiTheme="minorHAnsi" w:eastAsia="Times New Roman" w:hAnsiTheme="minorHAnsi" w:cstheme="minorHAnsi"/>
+          <w:color w:val="000000"/>
+          <w:sz w:val="22"/>
+          <w:szCs w:val="22"/>
+          <w:lang w:val="es-ES" w:eastAsia="ca-ES"/>
+        </w:rPr>
+        <w:t xml:space="preserve">. Asturias), 33600 </w:t>
+      </w:r>
+      <w:proofErr w:type="spellStart"/>
+      <w:r>
+        <w:rPr>
+          <w:rFonts w:asciiTheme="minorHAnsi" w:eastAsia="Times New Roman" w:hAnsiTheme="minorHAnsi" w:cstheme="minorHAnsi"/>
+          <w:color w:val="000000"/>
+          <w:sz w:val="22"/>
+          <w:szCs w:val="22"/>
+          <w:lang w:val="es-ES" w:eastAsia="ca-ES"/>
+        </w:rPr>
+        <w:t>Mieres</w:t>
+      </w:r>
+      <w:proofErr w:type="spellEnd"/>
+      <w:r>
+        <w:rPr>
+          <w:rFonts w:asciiTheme="minorHAnsi" w:eastAsia="Times New Roman" w:hAnsiTheme="minorHAnsi" w:cstheme="minorHAnsi"/>
+          <w:color w:val="000000"/>
+          <w:sz w:val="22"/>
+          <w:szCs w:val="22"/>
+          <w:lang w:val="es-ES" w:eastAsia="ca-ES"/>
+        </w:rPr>
+        <w:t xml:space="preserve">, </w:t>
+      </w:r>
+      <w:proofErr w:type="spellStart"/>
+      <w:r>
+        <w:rPr>
+          <w:rFonts w:asciiTheme="minorHAnsi" w:eastAsia="Times New Roman" w:hAnsiTheme="minorHAnsi" w:cstheme="minorHAnsi"/>
+          <w:color w:val="000000"/>
+          <w:sz w:val="22"/>
+          <w:szCs w:val="22"/>
+          <w:lang w:val="es-ES" w:eastAsia="ca-ES"/>
+        </w:rPr>
+        <w:t>Spain</w:t>
+      </w:r>
+      <w:proofErr w:type="spellEnd"/>
+      <w:r>
+        <w:rPr>
+          <w:rFonts w:asciiTheme="minorHAnsi" w:eastAsia="Times New Roman" w:hAnsiTheme="minorHAnsi" w:cstheme="minorHAnsi"/>
+          <w:color w:val="000000"/>
+          <w:sz w:val="22"/>
+          <w:szCs w:val="22"/>
+          <w:lang w:val="es-ES" w:eastAsia="ca-ES"/>
+        </w:rPr>
+        <w:t xml:space="preserve">. </w:t>
+      </w:r>
+      <w:hyperlink r:id="rId8" w:history="1">
+        <w:r>
+          <w:rPr>
+            <w:rStyle w:val="Hipervnculo"/>
+            <w:rFonts w:cstheme="minorHAnsi"/>
+            <w:lang w:val="es-ES"/>
+          </w:rPr>
+          <w:t>https://orcid.org/0000-0001-6601-9597</w:t>
+        </w:r>
+      </w:hyperlink>
+      <w:r>
+        <w:rPr>
+          <w:rStyle w:val="Hipervnculo"/>
+          <w:rFonts w:cstheme="minorHAnsi"/>
+          <w:lang w:val="es-ES"/>
+        </w:rPr>
+        <w:t xml:space="preserve">. </w:t>
+      </w:r>
+      <w:r>
+        <w:rPr>
+          <w:rFonts w:asciiTheme="minorHAnsi" w:hAnsiTheme="minorHAnsi" w:cstheme="minorBidi"/>
+          <w:sz w:val="22"/>
+          <w:szCs w:val="22"/>
+        </w:rPr>
+        <w:t>Email:</w:t>
+      </w:r>
+      <w:r>
+        <w:t xml:space="preserve"> </w:t>
+      </w:r>
+      <w:r>
+        <w:rPr>
+          <w:rFonts w:asciiTheme="minorHAnsi" w:hAnsiTheme="minorHAnsi" w:cstheme="minorBidi"/>
+          <w:sz w:val="22"/>
+          <w:szCs w:val="22"/>
+        </w:rPr>
+        <w:t>jimenezalfaro@uniovi.es</w:t>
+      </w:r>
+    </w:p>
+    <w:p>
+      <w:pPr>
+        <w:spacing w:after="0" w:line="360" w:lineRule="auto"/>
+        <w:textAlignment w:val="baseline"/>
+        <w:rPr>
+          <w:rFonts w:eastAsia="Times New Roman" w:cstheme="minorHAnsi"/>
+          <w:bCs/>
+          <w:color w:val="000000"/>
+          <w:bdr w:val="none" w:sz="0" w:space="0" w:color="auto" w:frame="1"/>
+          <w:lang w:val="es-ES" w:eastAsia="ca-ES"/>
+        </w:rPr>
+      </w:pPr>
     </w:p>
     <w:p>
       <w:pPr>
@@ -307,6 +841,7 @@
       <w:r>
         <w:rPr>
           <w:noProof/>
+          <w:lang w:val="ca-ES" w:eastAsia="ca-ES"/>
         </w:rPr>
         <w:drawing>
           <wp:inline distT="0" distB="0" distL="0" distR="0" wp14:anchorId="35A6DF40" wp14:editId="7D3AB554">
@@ -326,7 +861,7 @@
                     </pic:cNvPicPr>
                   </pic:nvPicPr>
                   <pic:blipFill>
-                    <a:blip r:embed="rId5" cstate="print">
+                    <a:blip r:embed="rId9" cstate="print">
                       <a:extLst>
                         <a:ext uri="{28A0092B-C50C-407E-A947-70E740481C1C}">
                           <a14:useLocalDpi xmlns:a14="http://schemas.microsoft.com/office/drawing/2010/main" val="0"/>
@@ -365,7 +900,6 @@
         </w:rPr>
       </w:pPr>
       <w:commentRangeStart w:id="0"/>
-      <w:commentRangeStart w:id="1"/>
       <w:r>
         <w:rPr>
           <w:lang w:val="en-US" w:eastAsia="ca-ES"/>
@@ -413,6 +947,7 @@
         <w:rPr>
           <w:lang w:val="en-US" w:eastAsia="ca-ES"/>
         </w:rPr>
+        <w:lastRenderedPageBreak/>
         <w:t>distribution</w:t>
       </w:r>
       <w:r>
@@ -439,13 +974,6 @@
           <w:rStyle w:val="Refdecomentario"/>
         </w:rPr>
         <w:commentReference w:id="0"/>
-      </w:r>
-      <w:commentRangeEnd w:id="1"/>
-      <w:r>
-        <w:rPr>
-          <w:rStyle w:val="Refdecomentario"/>
-        </w:rPr>
-        <w:commentReference w:id="1"/>
       </w:r>
     </w:p>
     <w:p>
@@ -461,6 +989,7 @@
       <w:r>
         <w:rPr>
           <w:noProof/>
+          <w:lang w:val="ca-ES" w:eastAsia="ca-ES"/>
         </w:rPr>
         <w:drawing>
           <wp:inline distT="0" distB="0" distL="0" distR="0" wp14:anchorId="1751824E" wp14:editId="041EC846">
@@ -480,7 +1009,7 @@
                     </pic:cNvPicPr>
                   </pic:nvPicPr>
                   <pic:blipFill rotWithShape="1">
-                    <a:blip r:embed="rId10" cstate="print">
+                    <a:blip r:embed="rId12" cstate="print">
                       <a:extLst>
                         <a:ext uri="{28A0092B-C50C-407E-A947-70E740481C1C}">
                           <a14:useLocalDpi xmlns:a14="http://schemas.microsoft.com/office/drawing/2010/main" val="0"/>
@@ -514,9 +1043,11 @@
           </wp:inline>
         </w:drawing>
       </w:r>
+      <w:bookmarkStart w:id="1" w:name="_GoBack"/>
       <w:r>
         <w:rPr>
           <w:noProof/>
+          <w:lang w:val="ca-ES" w:eastAsia="ca-ES"/>
         </w:rPr>
         <w:drawing>
           <wp:inline distT="0" distB="0" distL="0" distR="0" wp14:anchorId="682C49E4" wp14:editId="2F81080E">
@@ -536,7 +1067,7 @@
                     </pic:cNvPicPr>
                   </pic:nvPicPr>
                   <pic:blipFill>
-                    <a:blip r:embed="rId11" cstate="print">
+                    <a:blip r:embed="rId13" cstate="print">
                       <a:extLst>
                         <a:ext uri="{28A0092B-C50C-407E-A947-70E740481C1C}">
                           <a14:useLocalDpi xmlns:a14="http://schemas.microsoft.com/office/drawing/2010/main" val="0"/>
@@ -567,6 +1098,7 @@
           </wp:inline>
         </w:drawing>
       </w:r>
+      <w:bookmarkEnd w:id="1"/>
     </w:p>
     <w:p>
       <w:pPr>
@@ -774,6 +1306,7 @@
       <w:r>
         <w:rPr>
           <w:noProof/>
+          <w:lang w:val="ca-ES" w:eastAsia="ca-ES"/>
         </w:rPr>
         <w:drawing>
           <wp:inline distT="0" distB="0" distL="0" distR="0" wp14:anchorId="4D87B553" wp14:editId="20A1CAD6">
@@ -793,7 +1326,7 @@
                     </pic:cNvPicPr>
                   </pic:nvPicPr>
                   <pic:blipFill>
-                    <a:blip r:embed="rId12">
+                    <a:blip r:embed="rId14">
                       <a:extLst>
                         <a:ext uri="{28A0092B-C50C-407E-A947-70E740481C1C}">
                           <a14:useLocalDpi xmlns:a14="http://schemas.microsoft.com/office/drawing/2010/main" val="0"/>
@@ -1080,11 +1613,11 @@
       </w:tblPr>
       <w:tblGrid>
         <w:gridCol w:w="1599"/>
-        <w:gridCol w:w="1624"/>
-        <w:gridCol w:w="1611"/>
-        <w:gridCol w:w="1623"/>
-        <w:gridCol w:w="1549"/>
-        <w:gridCol w:w="1614"/>
+        <w:gridCol w:w="1635"/>
+        <w:gridCol w:w="1701"/>
+        <w:gridCol w:w="1697"/>
+        <w:gridCol w:w="1606"/>
+        <w:gridCol w:w="1668"/>
       </w:tblGrid>
       <w:tr>
         <w:trPr>
@@ -2205,6 +2738,7 @@
                 <w:lang w:val="es-ES" w:eastAsia="es-ES"/>
               </w:rPr>
             </w:pPr>
+            <w:proofErr w:type="spellStart"/>
             <w:r>
               <w:rPr>
                 <w:rFonts w:ascii="Aptos Narrow" w:eastAsia="Times New Roman" w:hAnsi="Aptos Narrow" w:cs="Times New Roman"/>
@@ -2213,6 +2747,7 @@
               </w:rPr>
               <w:t>langeanus</w:t>
             </w:r>
+            <w:proofErr w:type="spellEnd"/>
           </w:p>
         </w:tc>
         <w:tc>
@@ -4258,6 +4793,7 @@
         <w:rPr>
           <w:lang w:val="en-US" w:eastAsia="ca-ES"/>
         </w:rPr>
+        <w:lastRenderedPageBreak/>
         <w:fldChar w:fldCharType="end"/>
       </w:r>
     </w:p>
@@ -4271,7 +4807,6 @@
         <w:rPr>
           <w:lang w:val="en-US" w:eastAsia="ca-ES"/>
         </w:rPr>
-        <w:lastRenderedPageBreak/>
         <w:t xml:space="preserve">Here in each </w:t>
       </w:r>
       <w:proofErr w:type="spellStart"/>
@@ -4925,7 +5460,7 @@
 </file>
 
 <file path=word/comments.xml><?xml version="1.0" encoding="utf-8"?>
-<w:comments xmlns:wpc="http://schemas.microsoft.com/office/word/2010/wordprocessingCanvas" xmlns:cx="http://schemas.microsoft.com/office/drawing/2014/chartex" xmlns:cx1="http://schemas.microsoft.com/office/drawing/2015/9/8/chartex" xmlns:cx2="http://schemas.microsoft.com/office/drawing/2015/10/21/chartex" xmlns:cx3="http://schemas.microsoft.com/office/drawing/2016/5/9/chartex" xmlns:cx4="http://schemas.microsoft.com/office/drawing/2016/5/10/chartex" xmlns:cx5="http://schemas.microsoft.com/office/drawing/2016/5/11/chartex" xmlns:cx6="http://schemas.microsoft.com/office/drawing/2016/5/12/chartex" xmlns:cx7="http://schemas.microsoft.com/office/drawing/2016/5/13/chartex" xmlns:cx8="http://schemas.microsoft.com/office/drawing/2016/5/14/chartex" xmlns:mc="http://schemas.openxmlformats.org/markup-compatibility/2006" xmlns:aink="http://schemas.microsoft.com/office/drawing/2016/ink" xmlns:am3d="http://schemas.microsoft.com/office/drawing/2017/model3d" xmlns:o="urn:schemas-microsoft-com:office:office" xmlns:oel="http://schemas.microsoft.com/office/2019/extlst" xmlns:r="http://schemas.openxmlformats.org/officeDocument/2006/relationships" xmlns:m="http://schemas.openxmlformats.org/officeDocument/2006/math" xmlns:v="urn:schemas-microsoft-com:vml" xmlns:wp14="http://schemas.microsoft.com/office/word/2010/wordprocessingDrawing" xmlns:wp="http://schemas.openxmlformats.org/drawingml/2006/wordprocessingDrawing" xmlns:w10="urn:schemas-microsoft-com:office:word" xmlns:w="http://schemas.openxmlformats.org/wordprocessingml/2006/main" xmlns:w14="http://schemas.microsoft.com/office/word/2010/wordml" xmlns:w15="http://schemas.microsoft.com/office/word/2012/wordml" xmlns:w16cex="http://schemas.microsoft.com/office/word/2018/wordml/cex" xmlns:w16cid="http://schemas.microsoft.com/office/word/2016/wordml/cid" xmlns:w16="http://schemas.microsoft.com/office/word/2018/wordml" xmlns:w16sdtdh="http://schemas.microsoft.com/office/word/2020/wordml/sdtdatahash" xmlns:w16se="http://schemas.microsoft.com/office/word/2015/wordml/symex" xmlns:wpg="http://schemas.microsoft.com/office/word/2010/wordprocessingGroup" xmlns:wpi="http://schemas.microsoft.com/office/word/2010/wordprocessingInk" xmlns:wne="http://schemas.microsoft.com/office/word/2006/wordml" xmlns:wps="http://schemas.microsoft.com/office/word/2010/wordprocessingShape" mc:Ignorable="w14 w15 w16se w16cid w16 w16cex w16sdtdh wp14">
+<w:comments xmlns:wpc="http://schemas.microsoft.com/office/word/2010/wordprocessingCanvas" xmlns:mc="http://schemas.openxmlformats.org/markup-compatibility/2006" xmlns:o="urn:schemas-microsoft-com:office:office" xmlns:r="http://schemas.openxmlformats.org/officeDocument/2006/relationships" xmlns:m="http://schemas.openxmlformats.org/officeDocument/2006/math" xmlns:v="urn:schemas-microsoft-com:vml" xmlns:wp14="http://schemas.microsoft.com/office/word/2010/wordprocessingDrawing" xmlns:wp="http://schemas.openxmlformats.org/drawingml/2006/wordprocessingDrawing" xmlns:w10="urn:schemas-microsoft-com:office:word" xmlns:w="http://schemas.openxmlformats.org/wordprocessingml/2006/main" xmlns:w14="http://schemas.microsoft.com/office/word/2010/wordml" xmlns:w15="http://schemas.microsoft.com/office/word/2012/wordml" xmlns:wpg="http://schemas.microsoft.com/office/word/2010/wordprocessingGroup" xmlns:wpi="http://schemas.microsoft.com/office/word/2010/wordprocessingInk" xmlns:wne="http://schemas.microsoft.com/office/word/2006/wordml" xmlns:wps="http://schemas.microsoft.com/office/word/2010/wordprocessingShape" mc:Ignorable="w14 w15 wp14">
   <w:comment w:id="0" w:author="Gotzenberger Lars" w:date="2024-04-22T12:00:00Z" w:initials="GL">
     <w:p>
       <w:pPr>
@@ -4939,22 +5474,6 @@
       </w:r>
       <w:r>
         <w:t xml:space="preserve">I think one crucial aspect of ths study will be the spatial scale at which measures are taken and calculated. Since one of the main questions is about the differentiation of germination niches (in relation to the availabiulty of microsites), we could think about extending the 1m2 plots as the only scale at which to calculate FD and other measures, because then we could also account for spatial variation of microclimate.   </w:t>
-      </w:r>
-    </w:p>
-  </w:comment>
-  <w:comment w:id="1" w:author="CLARA ESPINOSA DEL ALBA" w:date="2024-04-26T10:05:00Z" w:initials="CE">
-    <w:p>
-      <w:pPr>
-        <w:pStyle w:val="Textocomentario"/>
-      </w:pPr>
-      <w:r>
-        <w:rPr>
-          <w:rStyle w:val="Refdecomentario"/>
-        </w:rPr>
-        <w:annotationRef/>
-      </w:r>
-      <w:r>
-        <w:t>What do you mean by extending?</w:t>
       </w:r>
     </w:p>
   </w:comment>
@@ -4986,10 +5505,7 @@
         <w:annotationRef/>
       </w:r>
       <w:r>
-        <w:t xml:space="preserve">Would it make (biological) sense to amend this by a variable that represents some overall “germinability”, as a total number or </w:t>
-      </w:r>
-      <w:r>
-        <w:t>prooption of seeds germinated across the 4 trials?</w:t>
+        <w:t>Would it make (biological) sense to amend this by a variable that represents some overall “germinability”, as a total number or prooption of seeds germinated across the 4 trials?</w:t>
       </w:r>
     </w:p>
     <w:p>
@@ -5091,13 +5607,7 @@
         <w:annotationRef/>
       </w:r>
       <w:r>
-        <w:t xml:space="preserve">You can absolutely count on my input, I think it can be a very nice and exciting </w:t>
-      </w:r>
-      <w:r>
-        <w:t xml:space="preserve">study!. The </w:t>
-      </w:r>
-      <w:r>
-        <w:t xml:space="preserve">exercieses from the book realy cover the very basics, and we definitely will need some customized approaches for the data. </w:t>
+        <w:t xml:space="preserve">You can absolutely count on my input, I think it can be a very nice and exciting study!. The exercieses from the book realy cover the very basics, and we definitely will need some customized approaches for the data. </w:t>
       </w:r>
     </w:p>
   </w:comment>
@@ -5145,9 +5655,8 @@
 </file>
 
 <file path=word/commentsExtended.xml><?xml version="1.0" encoding="utf-8"?>
-<w15:commentsEx xmlns:wpc="http://schemas.microsoft.com/office/word/2010/wordprocessingCanvas" xmlns:cx="http://schemas.microsoft.com/office/drawing/2014/chartex" xmlns:cx1="http://schemas.microsoft.com/office/drawing/2015/9/8/chartex" xmlns:cx2="http://schemas.microsoft.com/office/drawing/2015/10/21/chartex" xmlns:cx3="http://schemas.microsoft.com/office/drawing/2016/5/9/chartex" xmlns:cx4="http://schemas.microsoft.com/office/drawing/2016/5/10/chartex" xmlns:cx5="http://schemas.microsoft.com/office/drawing/2016/5/11/chartex" xmlns:cx6="http://schemas.microsoft.com/office/drawing/2016/5/12/chartex" xmlns:cx7="http://schemas.microsoft.com/office/drawing/2016/5/13/chartex" xmlns:cx8="http://schemas.microsoft.com/office/drawing/2016/5/14/chartex" xmlns:mc="http://schemas.openxmlformats.org/markup-compatibility/2006" xmlns:aink="http://schemas.microsoft.com/office/drawing/2016/ink" xmlns:am3d="http://schemas.microsoft.com/office/drawing/2017/model3d" xmlns:o="urn:schemas-microsoft-com:office:office" xmlns:oel="http://schemas.microsoft.com/office/2019/extlst" xmlns:r="http://schemas.openxmlformats.org/officeDocument/2006/relationships" xmlns:m="http://schemas.openxmlformats.org/officeDocument/2006/math" xmlns:v="urn:schemas-microsoft-com:vml" xmlns:wp14="http://schemas.microsoft.com/office/word/2010/wordprocessingDrawing" xmlns:wp="http://schemas.openxmlformats.org/drawingml/2006/wordprocessingDrawing" xmlns:w10="urn:schemas-microsoft-com:office:word" xmlns:w="http://schemas.openxmlformats.org/wordprocessingml/2006/main" xmlns:w14="http://schemas.microsoft.com/office/word/2010/wordml" xmlns:w15="http://schemas.microsoft.com/office/word/2012/wordml" xmlns:w16cex="http://schemas.microsoft.com/office/word/2018/wordml/cex" xmlns:w16cid="http://schemas.microsoft.com/office/word/2016/wordml/cid" xmlns:w16="http://schemas.microsoft.com/office/word/2018/wordml" xmlns:w16sdtdh="http://schemas.microsoft.com/office/word/2020/wordml/sdtdatahash" xmlns:w16se="http://schemas.microsoft.com/office/word/2015/wordml/symex" xmlns:wpg="http://schemas.microsoft.com/office/word/2010/wordprocessingGroup" xmlns:wpi="http://schemas.microsoft.com/office/word/2010/wordprocessingInk" xmlns:wne="http://schemas.microsoft.com/office/word/2006/wordml" xmlns:wps="http://schemas.microsoft.com/office/word/2010/wordprocessingShape" mc:Ignorable="w14 w15 w16se w16cid w16 w16cex w16sdtdh wp14">
+<w15:commentsEx xmlns:wpc="http://schemas.microsoft.com/office/word/2010/wordprocessingCanvas" xmlns:mc="http://schemas.openxmlformats.org/markup-compatibility/2006" xmlns:o="urn:schemas-microsoft-com:office:office" xmlns:r="http://schemas.openxmlformats.org/officeDocument/2006/relationships" xmlns:m="http://schemas.openxmlformats.org/officeDocument/2006/math" xmlns:v="urn:schemas-microsoft-com:vml" xmlns:wp14="http://schemas.microsoft.com/office/word/2010/wordprocessingDrawing" xmlns:wp="http://schemas.openxmlformats.org/drawingml/2006/wordprocessingDrawing" xmlns:w10="urn:schemas-microsoft-com:office:word" xmlns:w="http://schemas.openxmlformats.org/wordprocessingml/2006/main" xmlns:w14="http://schemas.microsoft.com/office/word/2010/wordml" xmlns:w15="http://schemas.microsoft.com/office/word/2012/wordml" xmlns:wpg="http://schemas.microsoft.com/office/word/2010/wordprocessingGroup" xmlns:wpi="http://schemas.microsoft.com/office/word/2010/wordprocessingInk" xmlns:wne="http://schemas.microsoft.com/office/word/2006/wordml" xmlns:wps="http://schemas.microsoft.com/office/word/2010/wordprocessingShape" mc:Ignorable="w14 w15 wp14">
   <w15:commentEx w15:paraId="297E875F" w15:done="0"/>
-  <w15:commentEx w15:paraId="4DFFD6DF" w15:paraIdParent="297E875F" w15:done="0"/>
   <w15:commentEx w15:paraId="7A3EBFE6" w15:done="0"/>
   <w15:commentEx w15:paraId="15352EF4" w15:done="0"/>
   <w15:commentEx w15:paraId="7B943DBE" w15:done="0"/>
@@ -5210,7 +5719,7 @@
 </file>
 
 <file path=word/numbering.xml><?xml version="1.0" encoding="utf-8"?>
-<w:numbering xmlns:wpc="http://schemas.microsoft.com/office/word/2010/wordprocessingCanvas" xmlns:cx="http://schemas.microsoft.com/office/drawing/2014/chartex" xmlns:cx1="http://schemas.microsoft.com/office/drawing/2015/9/8/chartex" xmlns:cx2="http://schemas.microsoft.com/office/drawing/2015/10/21/chartex" xmlns:cx3="http://schemas.microsoft.com/office/drawing/2016/5/9/chartex" xmlns:cx4="http://schemas.microsoft.com/office/drawing/2016/5/10/chartex" xmlns:cx5="http://schemas.microsoft.com/office/drawing/2016/5/11/chartex" xmlns:cx6="http://schemas.microsoft.com/office/drawing/2016/5/12/chartex" xmlns:cx7="http://schemas.microsoft.com/office/drawing/2016/5/13/chartex" xmlns:cx8="http://schemas.microsoft.com/office/drawing/2016/5/14/chartex" xmlns:mc="http://schemas.openxmlformats.org/markup-compatibility/2006" xmlns:aink="http://schemas.microsoft.com/office/drawing/2016/ink" xmlns:am3d="http://schemas.microsoft.com/office/drawing/2017/model3d" xmlns:o="urn:schemas-microsoft-com:office:office" xmlns:oel="http://schemas.microsoft.com/office/2019/extlst" xmlns:r="http://schemas.openxmlformats.org/officeDocument/2006/relationships" xmlns:m="http://schemas.openxmlformats.org/officeDocument/2006/math" xmlns:v="urn:schemas-microsoft-com:vml" xmlns:wp14="http://schemas.microsoft.com/office/word/2010/wordprocessingDrawing" xmlns:wp="http://schemas.openxmlformats.org/drawingml/2006/wordprocessingDrawing" xmlns:w10="urn:schemas-microsoft-com:office:word" xmlns:w="http://schemas.openxmlformats.org/wordprocessingml/2006/main" xmlns:w14="http://schemas.microsoft.com/office/word/2010/wordml" xmlns:w15="http://schemas.microsoft.com/office/word/2012/wordml" xmlns:w16cex="http://schemas.microsoft.com/office/word/2018/wordml/cex" xmlns:w16cid="http://schemas.microsoft.com/office/word/2016/wordml/cid" xmlns:w16="http://schemas.microsoft.com/office/word/2018/wordml" xmlns:w16sdtdh="http://schemas.microsoft.com/office/word/2020/wordml/sdtdatahash" xmlns:w16se="http://schemas.microsoft.com/office/word/2015/wordml/symex" xmlns:wpg="http://schemas.microsoft.com/office/word/2010/wordprocessingGroup" xmlns:wpi="http://schemas.microsoft.com/office/word/2010/wordprocessingInk" xmlns:wne="http://schemas.microsoft.com/office/word/2006/wordml" xmlns:wps="http://schemas.microsoft.com/office/word/2010/wordprocessingShape" mc:Ignorable="w14 w15 w16se w16cid w16 w16cex w16sdtdh wp14">
+<w:numbering xmlns:wpc="http://schemas.microsoft.com/office/word/2010/wordprocessingCanvas" xmlns:mc="http://schemas.openxmlformats.org/markup-compatibility/2006" xmlns:o="urn:schemas-microsoft-com:office:office" xmlns:r="http://schemas.openxmlformats.org/officeDocument/2006/relationships" xmlns:m="http://schemas.openxmlformats.org/officeDocument/2006/math" xmlns:v="urn:schemas-microsoft-com:vml" xmlns:wp14="http://schemas.microsoft.com/office/word/2010/wordprocessingDrawing" xmlns:wp="http://schemas.openxmlformats.org/drawingml/2006/wordprocessingDrawing" xmlns:w10="urn:schemas-microsoft-com:office:word" xmlns:w="http://schemas.openxmlformats.org/wordprocessingml/2006/main" xmlns:w14="http://schemas.microsoft.com/office/word/2010/wordml" xmlns:w15="http://schemas.microsoft.com/office/word/2012/wordml" xmlns:wpg="http://schemas.microsoft.com/office/word/2010/wordprocessingGroup" xmlns:wpi="http://schemas.microsoft.com/office/word/2010/wordprocessingInk" xmlns:wne="http://schemas.microsoft.com/office/word/2006/wordml" xmlns:wps="http://schemas.microsoft.com/office/word/2010/wordprocessingShape" mc:Ignorable="w14 w15 wp14">
   <w:abstractNum w:abstractNumId="0" w15:restartNumberingAfterBreak="0">
     <w:nsid w:val="03CA06DB"/>
     <w:multiLevelType w:val="hybridMultilevel"/>
@@ -5905,32 +6414,32 @@
       </w:pPr>
     </w:lvl>
   </w:abstractNum>
-  <w:num w:numId="1" w16cid:durableId="258022888">
+  <w:num w:numId="1">
     <w:abstractNumId w:val="2"/>
   </w:num>
-  <w:num w:numId="2" w16cid:durableId="176387307">
+  <w:num w:numId="2">
     <w:abstractNumId w:val="0"/>
   </w:num>
-  <w:num w:numId="3" w16cid:durableId="189880033">
+  <w:num w:numId="3">
     <w:abstractNumId w:val="5"/>
   </w:num>
-  <w:num w:numId="4" w16cid:durableId="1745449050">
+  <w:num w:numId="4">
     <w:abstractNumId w:val="3"/>
   </w:num>
-  <w:num w:numId="5" w16cid:durableId="278923639">
+  <w:num w:numId="5">
     <w:abstractNumId w:val="6"/>
   </w:num>
-  <w:num w:numId="6" w16cid:durableId="2064206173">
+  <w:num w:numId="6">
     <w:abstractNumId w:val="1"/>
   </w:num>
-  <w:num w:numId="7" w16cid:durableId="494536358">
+  <w:num w:numId="7">
     <w:abstractNumId w:val="4"/>
   </w:num>
 </w:numbering>
 </file>
 
 <file path=word/people.xml><?xml version="1.0" encoding="utf-8"?>
-<w15:people xmlns:wpc="http://schemas.microsoft.com/office/word/2010/wordprocessingCanvas" xmlns:cx="http://schemas.microsoft.com/office/drawing/2014/chartex" xmlns:cx1="http://schemas.microsoft.com/office/drawing/2015/9/8/chartex" xmlns:cx2="http://schemas.microsoft.com/office/drawing/2015/10/21/chartex" xmlns:cx3="http://schemas.microsoft.com/office/drawing/2016/5/9/chartex" xmlns:cx4="http://schemas.microsoft.com/office/drawing/2016/5/10/chartex" xmlns:cx5="http://schemas.microsoft.com/office/drawing/2016/5/11/chartex" xmlns:cx6="http://schemas.microsoft.com/office/drawing/2016/5/12/chartex" xmlns:cx7="http://schemas.microsoft.com/office/drawing/2016/5/13/chartex" xmlns:cx8="http://schemas.microsoft.com/office/drawing/2016/5/14/chartex" xmlns:mc="http://schemas.openxmlformats.org/markup-compatibility/2006" xmlns:aink="http://schemas.microsoft.com/office/drawing/2016/ink" xmlns:am3d="http://schemas.microsoft.com/office/drawing/2017/model3d" xmlns:o="urn:schemas-microsoft-com:office:office" xmlns:oel="http://schemas.microsoft.com/office/2019/extlst" xmlns:r="http://schemas.openxmlformats.org/officeDocument/2006/relationships" xmlns:m="http://schemas.openxmlformats.org/officeDocument/2006/math" xmlns:v="urn:schemas-microsoft-com:vml" xmlns:wp14="http://schemas.microsoft.com/office/word/2010/wordprocessingDrawing" xmlns:wp="http://schemas.openxmlformats.org/drawingml/2006/wordprocessingDrawing" xmlns:w10="urn:schemas-microsoft-com:office:word" xmlns:w="http://schemas.openxmlformats.org/wordprocessingml/2006/main" xmlns:w14="http://schemas.microsoft.com/office/word/2010/wordml" xmlns:w15="http://schemas.microsoft.com/office/word/2012/wordml" xmlns:w16cex="http://schemas.microsoft.com/office/word/2018/wordml/cex" xmlns:w16cid="http://schemas.microsoft.com/office/word/2016/wordml/cid" xmlns:w16="http://schemas.microsoft.com/office/word/2018/wordml" xmlns:w16sdtdh="http://schemas.microsoft.com/office/word/2020/wordml/sdtdatahash" xmlns:w16se="http://schemas.microsoft.com/office/word/2015/wordml/symex" xmlns:wpg="http://schemas.microsoft.com/office/word/2010/wordprocessingGroup" xmlns:wpi="http://schemas.microsoft.com/office/word/2010/wordprocessingInk" xmlns:wne="http://schemas.microsoft.com/office/word/2006/wordml" xmlns:wps="http://schemas.microsoft.com/office/word/2010/wordprocessingShape" mc:Ignorable="w14 w15 w16se w16cid w16 w16cex w16sdtdh wp14">
+<w15:people xmlns:wpc="http://schemas.microsoft.com/office/word/2010/wordprocessingCanvas" xmlns:mc="http://schemas.openxmlformats.org/markup-compatibility/2006" xmlns:o="urn:schemas-microsoft-com:office:office" xmlns:r="http://schemas.openxmlformats.org/officeDocument/2006/relationships" xmlns:m="http://schemas.openxmlformats.org/officeDocument/2006/math" xmlns:v="urn:schemas-microsoft-com:vml" xmlns:wp14="http://schemas.microsoft.com/office/word/2010/wordprocessingDrawing" xmlns:wp="http://schemas.openxmlformats.org/drawingml/2006/wordprocessingDrawing" xmlns:w10="urn:schemas-microsoft-com:office:word" xmlns:w="http://schemas.openxmlformats.org/wordprocessingml/2006/main" xmlns:w14="http://schemas.microsoft.com/office/word/2010/wordml" xmlns:w15="http://schemas.microsoft.com/office/word/2012/wordml" xmlns:wpg="http://schemas.microsoft.com/office/word/2010/wordprocessingGroup" xmlns:wpi="http://schemas.microsoft.com/office/word/2010/wordprocessingInk" xmlns:wne="http://schemas.microsoft.com/office/word/2006/wordml" xmlns:wps="http://schemas.microsoft.com/office/word/2010/wordprocessingShape" mc:Ignorable="w14 w15 wp14">
   <w15:person w15:author="Gotzenberger Lars">
     <w15:presenceInfo w15:providerId="AD" w15:userId="S-1-5-21-4172305997-723020702-3064973202-14172"/>
   </w15:person>
@@ -5941,7 +6450,7 @@
 </file>
 
 <file path=word/styles.xml><?xml version="1.0" encoding="utf-8"?>
-<w:styles xmlns:mc="http://schemas.openxmlformats.org/markup-compatibility/2006" xmlns:r="http://schemas.openxmlformats.org/officeDocument/2006/relationships" xmlns:w="http://schemas.openxmlformats.org/wordprocessingml/2006/main" xmlns:w14="http://schemas.microsoft.com/office/word/2010/wordml" xmlns:w15="http://schemas.microsoft.com/office/word/2012/wordml" xmlns:w16cex="http://schemas.microsoft.com/office/word/2018/wordml/cex" xmlns:w16cid="http://schemas.microsoft.com/office/word/2016/wordml/cid" xmlns:w16="http://schemas.microsoft.com/office/word/2018/wordml" xmlns:w16sdtdh="http://schemas.microsoft.com/office/word/2020/wordml/sdtdatahash" xmlns:w16se="http://schemas.microsoft.com/office/word/2015/wordml/symex" mc:Ignorable="w14 w15 w16se w16cid w16 w16cex w16sdtdh">
+<w:styles xmlns:mc="http://schemas.openxmlformats.org/markup-compatibility/2006" xmlns:r="http://schemas.openxmlformats.org/officeDocument/2006/relationships" xmlns:w="http://schemas.openxmlformats.org/wordprocessingml/2006/main" xmlns:w14="http://schemas.microsoft.com/office/word/2010/wordml" xmlns:w15="http://schemas.microsoft.com/office/word/2012/wordml" mc:Ignorable="w14 w15">
   <w:docDefaults>
     <w:rPrDefault>
       <w:rPr>
@@ -5959,7 +6468,7 @@
       </w:pPr>
     </w:pPrDefault>
   </w:docDefaults>
-  <w:latentStyles w:defLockedState="0" w:defUIPriority="99" w:defSemiHidden="0" w:defUnhideWhenUsed="0" w:defQFormat="0" w:count="376">
+  <w:latentStyles w:defLockedState="0" w:defUIPriority="99" w:defSemiHidden="0" w:defUnhideWhenUsed="0" w:defQFormat="0" w:count="371">
     <w:lsdException w:name="Normal" w:uiPriority="0" w:qFormat="1"/>
     <w:lsdException w:name="heading 1" w:uiPriority="9" w:qFormat="1"/>
     <w:lsdException w:name="heading 2" w:semiHidden="1" w:uiPriority="9" w:unhideWhenUsed="1" w:qFormat="1"/>
@@ -6331,11 +6840,6 @@
     <w:lsdException w:name="List Table 5 Dark Accent 6" w:uiPriority="50"/>
     <w:lsdException w:name="List Table 6 Colorful Accent 6" w:uiPriority="51"/>
     <w:lsdException w:name="List Table 7 Colorful Accent 6" w:uiPriority="52"/>
-    <w:lsdException w:name="Mention" w:semiHidden="1" w:unhideWhenUsed="1"/>
-    <w:lsdException w:name="Smart Hyperlink" w:semiHidden="1" w:unhideWhenUsed="1"/>
-    <w:lsdException w:name="Hashtag" w:semiHidden="1" w:unhideWhenUsed="1"/>
-    <w:lsdException w:name="Unresolved Mention" w:semiHidden="1" w:unhideWhenUsed="1"/>
-    <w:lsdException w:name="Smart Link" w:semiHidden="1" w:unhideWhenUsed="1"/>
   </w:latentStyles>
   <w:style w:type="paragraph" w:default="1" w:styleId="Normal">
     <w:name w:val="Normal"/>
@@ -6701,11 +7205,11 @@
       <w:lang w:val="en-GB"/>
     </w:rPr>
   </w:style>
-  <w:style w:type="paragraph" w:styleId="Ttulo">
+  <w:style w:type="paragraph" w:styleId="Puesto">
     <w:name w:val="Title"/>
     <w:basedOn w:val="Normal"/>
     <w:next w:val="Normal"/>
-    <w:link w:val="TtuloCar"/>
+    <w:link w:val="PuestoCar"/>
     <w:uiPriority w:val="10"/>
     <w:qFormat/>
     <w:rsid w:val="00D03435"/>
@@ -6721,10 +7225,10 @@
       <w:szCs w:val="56"/>
     </w:rPr>
   </w:style>
-  <w:style w:type="character" w:customStyle="1" w:styleId="TtuloCar">
-    <w:name w:val="Título Car"/>
+  <w:style w:type="character" w:customStyle="1" w:styleId="PuestoCar">
+    <w:name w:val="Puesto Car"/>
     <w:basedOn w:val="Fuentedeprrafopredeter"/>
-    <w:link w:val="Ttulo"/>
+    <w:link w:val="Puesto"/>
     <w:uiPriority w:val="10"/>
     <w:rsid w:val="00D03435"/>
     <w:rPr>
@@ -7027,7 +7531,7 @@
       <w:u w:val="single"/>
     </w:rPr>
   </w:style>
-  <w:style w:type="character" w:styleId="Mencinsinresolver">
+  <w:style w:type="character" w:customStyle="1" w:styleId="UnresolvedMention">
     <w:name w:val="Unresolved Mention"/>
     <w:basedOn w:val="Fuentedeprrafopredeter"/>
     <w:uiPriority w:val="99"/>
@@ -7037,6 +7541,48 @@
     <w:rPr>
       <w:color w:val="605E5C"/>
       <w:shd w:val="clear" w:color="auto" w:fill="E1DFDD"/>
+    </w:rPr>
+  </w:style>
+  <w:style w:type="paragraph" w:customStyle="1" w:styleId="FirstParagraph">
+    <w:name w:val="First Paragraph"/>
+    <w:basedOn w:val="Textoindependiente"/>
+    <w:next w:val="Textoindependiente"/>
+    <w:qFormat/>
+    <w:rsid w:val="000E6600"/>
+    <w:pPr>
+      <w:spacing w:before="180" w:after="180" w:line="360" w:lineRule="auto"/>
+      <w:jc w:val="both"/>
+    </w:pPr>
+    <w:rPr>
+      <w:rFonts w:ascii="Arial" w:hAnsi="Arial" w:cs="Arial"/>
+      <w:sz w:val="24"/>
+      <w:szCs w:val="24"/>
+      <w:lang w:val="en-US"/>
+    </w:rPr>
+  </w:style>
+  <w:style w:type="paragraph" w:styleId="Textoindependiente">
+    <w:name w:val="Body Text"/>
+    <w:basedOn w:val="Normal"/>
+    <w:link w:val="TextoindependienteCar"/>
+    <w:uiPriority w:val="99"/>
+    <w:semiHidden/>
+    <w:unhideWhenUsed/>
+    <w:rsid w:val="000E6600"/>
+    <w:pPr>
+      <w:spacing w:after="120"/>
+    </w:pPr>
+  </w:style>
+  <w:style w:type="character" w:customStyle="1" w:styleId="TextoindependienteCar">
+    <w:name w:val="Texto independiente Car"/>
+    <w:basedOn w:val="Fuentedeprrafopredeter"/>
+    <w:link w:val="Textoindependiente"/>
+    <w:uiPriority w:val="99"/>
+    <w:semiHidden/>
+    <w:rsid w:val="000E6600"/>
+    <w:rPr>
+      <w:kern w:val="0"/>
+      <w:lang w:val="en-GB"/>
+      <w14:ligatures w14:val="none"/>
     </w:rPr>
   </w:style>
 </w:styles>

</xml_diff>